<commit_message>
Pagine provincia AA vuote: da non pubblicare finché vuote; nel primo invio RetailTune come nuove pagine provincia
Co-Authored-By: Claude Opus 5.5 <noreply@anthropic.com>
Claude-Session: https://claude.ai/code/session_01Rr1X44gsg7BUwMzrRvYrc2
</commit_message>
<xml_diff>
--- a/docs/docx/invio-1-configurazione.docx
+++ b/docs/docx/invio-1-configurazione.docx
@@ -1681,6 +1681,62 @@
             </w:pPr>
             <w:r>
               <w:t xml:space="preserve">sostituisce la mappa attuale</w:t>
+            </w:r>
+          </w:p>
+        </w:tc>
+      </w:tr>
+      <w:tr>
+        <w:tc>
+          <w:tcPr/>
+          <w:p>
+            <w:pPr>
+              <w:pStyle w:val="Compact"/>
+              <w:jc w:val="left"/>
+            </w:pPr>
+            <w:r>
+              <w:t xml:space="preserve">Nuove pagine provincia (fino a 11, in preparazione: Ascoli Piceno, Asti, Como, Fermo, Grosseto, Imperia, Pesaro e Urbino, Reggio Emilia, Roma, Rovigo, Vercelli)</w:t>
+            </w:r>
+          </w:p>
+        </w:tc>
+        <w:tc>
+          <w:tcPr/>
+          <w:p>
+            <w:pPr>
+              <w:pStyle w:val="Compact"/>
+              <w:jc w:val="left"/>
+            </w:pPr>
+            <w:r>
+              <w:rPr>
+                <w:rStyle w:val="VerbatimChar"/>
+              </w:rPr>
+              <w:t xml:space="preserve">residenze-per-anziani</w:t>
+            </w:r>
+            <w:r>
+              <w:t xml:space="preserve">, fissa</w:t>
+            </w:r>
+          </w:p>
+        </w:tc>
+        <w:tc>
+          <w:tcPr/>
+          <w:p>
+            <w:pPr>
+              <w:pStyle w:val="Compact"/>
+              <w:jc w:val="left"/>
+            </w:pPr>
+            <w:r>
+              <w:t xml:space="preserve">provincia, fissa</w:t>
+            </w:r>
+          </w:p>
+        </w:tc>
+        <w:tc>
+          <w:tcPr/>
+          <w:p>
+            <w:pPr>
+              <w:pStyle w:val="Compact"/>
+              <w:jc w:val="left"/>
+            </w:pPr>
+            <w:r>
+              <w:t xml:space="preserve">stessa configurazione delle pagine provincia esistenti</w:t>
             </w:r>
           </w:p>
         </w:tc>

</xml_diff>